<commit_message>
M26 T5: regenerate the BF paper forms with the Total row
Both BF DOCX now print a Total row listing all 25 items, keyed to
pid_scales rather than hardcoded; it occupies the previously blank
padding cell so the table stays 3x2. Two new hitop_artifacts rows.

artifacts.R gains rebuild_stems/rebuild_formats (default NULL = prior
behavior): sourcing it wholesale churns every artifact's checksum via
the Sys.Date() DOCX footer and REDCap zip mtimes, which would append 19
manifest rows for a BF-only change and break AC4's byte-identical
requirement for the BF Qualtrics/REDCap exports.

Co-Authored-By: Claude Opus 5 <noreply@anthropic.com>
</commit_message>
<xml_diff>
--- a/inst/extdata/pid5bf_A4.docx
+++ b/inst/extdata/pid5bf_A4.docx
@@ -8004,7 +8004,7 @@
                 <w:szCs w:val="18"/>
                 <w:color w:val="000000"/>
               </w:rPr>
-              <w:t xml:space="preserve"/>
+              <w:t xml:space="preserve">Total</w:t>
             </w:r>
           </w:p>
         </w:tc>
@@ -8059,7 +8059,7 @@
                 <w:szCs w:val="18"/>
                 <w:color w:val="000000"/>
               </w:rPr>
-              <w:t xml:space="preserve"/>
+              <w:t xml:space="preserve">1, 2, 3, 4, 5, 6, 7, 8, 9, 10, 11, 12, 13, 14, 15, 16, 17, 18, 19, 20, 21, 22, 23, 24, 25</w:t>
             </w:r>
           </w:p>
         </w:tc>
@@ -8110,7 +8110,7 @@
         <w:szCs w:val="16"/>
         <w:color w:val="BEBEBE"/>
       </w:rPr>
-      <w:t xml:space="preserve">Generated 2026-07-16 · hitop 0.2.0</w:t>
+      <w:t xml:space="preserve">Generated 2026-07-30 · hitop 0.2.0</w:t>
     </w:r>
     <w:r>
       <w:rPr>

</xml_diff>

<commit_message>
PID-5-BF total score across scoring, reliability, and the BF paper forms (#29)
score_pid5(version = "BF") gains a `total` column: the item-level mean over
all 25 items, per Markon et al. (2024, p. 23). Settles the rule D-017 left
open and gives the brief form's normed total in `pid_norms` something to
convert.

The total is a real `pid_scales[["BF"]]` row rather than a scorer special
case (D-019), so it also reaches that table's other consumers:
`reliability_pid5(version = "BF")` returns six rows, and both PID-5-BF Word
forms print a Total row. Both are breaking output changes, NEWS-flagged
under GP2; PID-5 and PID-5-SF are unaffected.

D-021 records that the total prorates independently of the domains under
missing = "apa". data-raw/artifacts.R gains validated rebuild_stems /
rebuild_formats filters so a single instrument can be regenerated without
churning every artifact's checksum.
</commit_message>
<xml_diff>
--- a/inst/extdata/pid5bf_A4.docx
+++ b/inst/extdata/pid5bf_A4.docx
@@ -8004,7 +8004,7 @@
                 <w:szCs w:val="18"/>
                 <w:color w:val="000000"/>
               </w:rPr>
-              <w:t xml:space="preserve"/>
+              <w:t xml:space="preserve">Total</w:t>
             </w:r>
           </w:p>
         </w:tc>
@@ -8059,7 +8059,7 @@
                 <w:szCs w:val="18"/>
                 <w:color w:val="000000"/>
               </w:rPr>
-              <w:t xml:space="preserve"/>
+              <w:t xml:space="preserve">1, 2, 3, 4, 5, 6, 7, 8, 9, 10, 11, 12, 13, 14, 15, 16, 17, 18, 19, 20, 21, 22, 23, 24, 25</w:t>
             </w:r>
           </w:p>
         </w:tc>
@@ -8110,7 +8110,7 @@
         <w:szCs w:val="16"/>
         <w:color w:val="BEBEBE"/>
       </w:rPr>
-      <w:t xml:space="preserve">Generated 2026-07-16 · hitop 0.2.0</w:t>
+      <w:t xml:space="preserve">Generated 2026-07-30 · hitop 0.2.0</w:t>
     </w:r>
     <w:r>
       <w:rPr>

</xml_diff>

<commit_message>
M36 T3: regenerate the six PID DOCX with the two-line legend
Co-Authored-By: Claude Opus 5 <noreply@anthropic.com>
</commit_message>
<xml_diff>
--- a/inst/extdata/pid5bf_A4.docx
+++ b/inst/extdata/pid5bf_A4.docx
@@ -51,7 +51,7 @@
           <w:tcPr>
             <w:gridSpan w:val="5"/>
             <w:tcBorders>
-              <w:bottom w:val="single" w:sz="12" w:space="0" w:color="000000"/>
+              <w:bottom w:val="none" w:sz="0" w:space="0" w:color="FFFFFF"/>
               <w:top w:val="single" w:sz="12" w:space="0" w:color="000000"/>
               <w:left w:val="none" w:sz="0" w:space="0" w:color="FFFFFF"/>
               <w:right w:val="none" w:sz="0" w:space="0" w:color="FFFFFF"/>
@@ -99,7 +99,69 @@
                 <w:szCs w:val="20"/>
                 <w:color w:val="000000"/>
               </w:rPr>
-              <w:t xml:space="preserve">0 = Very False or Often False • 1 = Sometimes or Somewhat False • 2 = Sometimes or Somewhat True • 3 = Very True or Often True</w:t>
+              <w:t xml:space="preserve">0 = Very False or Often False • 1 = Sometimes or Somewhat False</w:t>
+            </w:r>
+          </w:p>
+        </w:tc>
+      </w:tr>
+      <w:tr>
+        <w:trPr>
+          <w:trHeight w:val="360" w:hRule="auto"/>
+          <w:tblHeader/>
+        </w:trPr>
+        <w:tc>
+          <w:tcPr>
+            <w:gridSpan w:val="5"/>
+            <w:tcBorders>
+              <w:bottom w:val="single" w:sz="12" w:space="0" w:color="000000"/>
+              <w:top w:val="none" w:sz="0" w:space="0" w:color="FFFFFF"/>
+              <w:left w:val="none" w:sz="0" w:space="0" w:color="FFFFFF"/>
+              <w:right w:val="none" w:sz="0" w:space="0" w:color="FFFFFF"/>
+            </w:tcBorders>
+            <w:shd w:val="clear" w:color="auto" w:fill="FFFFFF"/>
+            <w:tcMar>
+              <w:top w:w="0" w:type="dxa"/>
+              <w:bottom w:w="0" w:type="dxa"/>
+              <w:left w:w="0" w:type="dxa"/>
+              <w:right w:w="0" w:type="dxa"/>
+            </w:tcMar>
+            <w:vAlign w:val="center"/>
+          </w:tcPr>
+          <w:p>
+            <w:pPr>
+              <w:pStyle w:val="Normal"/>
+              <w:jc w:val="center"/>
+              <w:pBdr>
+                <w:bottom w:val="none" w:sz="0" w:space="0" w:color="000000"/>
+                <w:top w:val="none" w:sz="0" w:space="0" w:color="000000"/>
+                <w:left w:val="none" w:sz="0" w:space="0" w:color="000000"/>
+                <w:right w:val="none" w:sz="0" w:space="0" w:color="000000"/>
+              </w:pBdr>
+              <w:spacing w:after="100" w:before="100" w:line="240"/>
+              <w:ind w:left="100" w:right="100" w:firstLine="0" w:firstLineChars="0"/>
+              <w:rPr>
+                <w:rFonts w:ascii="Times New Roman" w:hAnsi="Times New Roman" w:eastAsia="Times New Roman" w:cs="Times New Roman"/>
+                <w:i w:val="false"/>
+                <w:b w:val="false"/>
+                <w:u w:val="none"/>
+                <w:strike w:val="false"/>
+                <w:sz w:val="20"/>
+                <w:szCs w:val="20"/>
+                <w:color w:val="000000"/>
+              </w:rPr>
+            </w:pPr>
+            <w:r>
+              <w:rPr>
+                <w:rFonts w:ascii="Times New Roman" w:hAnsi="Times New Roman" w:eastAsia="Times New Roman" w:cs="Times New Roman"/>
+                <w:i w:val="false"/>
+                <w:b w:val="false"/>
+                <w:u w:val="none"/>
+                <w:strike w:val="false"/>
+                <w:sz w:val="20"/>
+                <w:szCs w:val="20"/>
+                <w:color w:val="000000"/>
+              </w:rPr>
+              <w:t xml:space="preserve">2 = Sometimes or Somewhat True • 3 = Very True or Often True</w:t>
             </w:r>
           </w:p>
         </w:tc>
@@ -8110,7 +8172,7 @@
         <w:szCs w:val="16"/>
         <w:color w:val="BEBEBE"/>
       </w:rPr>
-      <w:t xml:space="preserve">Generated 2026-07-30 · hitop 0.2.0</w:t>
+      <w:t xml:space="preserve">Generated 2026-07-31 · hitop 0.2.0</w:t>
     </w:r>
     <w:r>
       <w:rPr>

</xml_diff>

<commit_message>
M36: two-line response-option legend on the PID paper forms (#39)
The PID-5, PID-5-SF and PID-5-BF paper forms print their response-option legend on two lines of two options each, so no option phrase is broken mid-phrase by column wrapping. HiTOP-SR/BR keep their single-line legend; wording, values and labels are unchanged.

Also fixes an abort in the same helper: the even-row shading index seq(2, n, by = 2) counts backwards at n = 1 and errors on a one-item table.

The six committed PID DOCX (US and A4) are regenerated, each with a new hitop_artifacts row.
</commit_message>
<xml_diff>
--- a/inst/extdata/pid5bf_A4.docx
+++ b/inst/extdata/pid5bf_A4.docx
@@ -51,7 +51,7 @@
           <w:tcPr>
             <w:gridSpan w:val="5"/>
             <w:tcBorders>
-              <w:bottom w:val="single" w:sz="12" w:space="0" w:color="000000"/>
+              <w:bottom w:val="none" w:sz="0" w:space="0" w:color="FFFFFF"/>
               <w:top w:val="single" w:sz="12" w:space="0" w:color="000000"/>
               <w:left w:val="none" w:sz="0" w:space="0" w:color="FFFFFF"/>
               <w:right w:val="none" w:sz="0" w:space="0" w:color="FFFFFF"/>
@@ -99,7 +99,69 @@
                 <w:szCs w:val="20"/>
                 <w:color w:val="000000"/>
               </w:rPr>
-              <w:t xml:space="preserve">0 = Very False or Often False • 1 = Sometimes or Somewhat False • 2 = Sometimes or Somewhat True • 3 = Very True or Often True</w:t>
+              <w:t xml:space="preserve">0 = Very False or Often False • 1 = Sometimes or Somewhat False</w:t>
+            </w:r>
+          </w:p>
+        </w:tc>
+      </w:tr>
+      <w:tr>
+        <w:trPr>
+          <w:trHeight w:val="360" w:hRule="auto"/>
+          <w:tblHeader/>
+        </w:trPr>
+        <w:tc>
+          <w:tcPr>
+            <w:gridSpan w:val="5"/>
+            <w:tcBorders>
+              <w:bottom w:val="single" w:sz="12" w:space="0" w:color="000000"/>
+              <w:top w:val="none" w:sz="0" w:space="0" w:color="FFFFFF"/>
+              <w:left w:val="none" w:sz="0" w:space="0" w:color="FFFFFF"/>
+              <w:right w:val="none" w:sz="0" w:space="0" w:color="FFFFFF"/>
+            </w:tcBorders>
+            <w:shd w:val="clear" w:color="auto" w:fill="FFFFFF"/>
+            <w:tcMar>
+              <w:top w:w="0" w:type="dxa"/>
+              <w:bottom w:w="0" w:type="dxa"/>
+              <w:left w:w="0" w:type="dxa"/>
+              <w:right w:w="0" w:type="dxa"/>
+            </w:tcMar>
+            <w:vAlign w:val="center"/>
+          </w:tcPr>
+          <w:p>
+            <w:pPr>
+              <w:pStyle w:val="Normal"/>
+              <w:jc w:val="center"/>
+              <w:pBdr>
+                <w:bottom w:val="none" w:sz="0" w:space="0" w:color="000000"/>
+                <w:top w:val="none" w:sz="0" w:space="0" w:color="000000"/>
+                <w:left w:val="none" w:sz="0" w:space="0" w:color="000000"/>
+                <w:right w:val="none" w:sz="0" w:space="0" w:color="000000"/>
+              </w:pBdr>
+              <w:spacing w:after="100" w:before="100" w:line="240"/>
+              <w:ind w:left="100" w:right="100" w:firstLine="0" w:firstLineChars="0"/>
+              <w:rPr>
+                <w:rFonts w:ascii="Times New Roman" w:hAnsi="Times New Roman" w:eastAsia="Times New Roman" w:cs="Times New Roman"/>
+                <w:i w:val="false"/>
+                <w:b w:val="false"/>
+                <w:u w:val="none"/>
+                <w:strike w:val="false"/>
+                <w:sz w:val="20"/>
+                <w:szCs w:val="20"/>
+                <w:color w:val="000000"/>
+              </w:rPr>
+            </w:pPr>
+            <w:r>
+              <w:rPr>
+                <w:rFonts w:ascii="Times New Roman" w:hAnsi="Times New Roman" w:eastAsia="Times New Roman" w:cs="Times New Roman"/>
+                <w:i w:val="false"/>
+                <w:b w:val="false"/>
+                <w:u w:val="none"/>
+                <w:strike w:val="false"/>
+                <w:sz w:val="20"/>
+                <w:szCs w:val="20"/>
+                <w:color w:val="000000"/>
+              </w:rPr>
+              <w:t xml:space="preserve">2 = Sometimes or Somewhat True • 3 = Very True or Often True</w:t>
             </w:r>
           </w:p>
         </w:tc>
@@ -8110,7 +8172,7 @@
         <w:szCs w:val="16"/>
         <w:color w:val="BEBEBE"/>
       </w:rPr>
-      <w:t xml:space="preserve">Generated 2026-07-30 · hitop 0.2.0</w:t>
+      <w:t xml:space="preserve">Generated 2026-07-31 · hitop 0.2.0</w:t>
     </w:r>
     <w:r>
       <w:rPr>

</xml_diff>